<commit_message>
Fix T9 and T12 QA gaps
</commit_message>
<xml_diff>
--- a/output/doc/ReportX-Full-Main-QA-Report-2026-05-13.docx
+++ b/output/doc/ReportX-Full-Main-QA-Report-2026-05-13.docx
@@ -3208,6 +3208,303 @@
         <w:t>Final signoff status: conditionally passed. The condition is that live OpenAI quality checks still require adding a real `OPENAI_API_KEY` to the local `.env` and rerunning the AI-specific parse/explain/translation cases. Everything else covered by this pass is green.</w:t>
       </w:r>
     </w:p>
+    <w:p>
+      <w:r>
+        <w:br w:type="page"/>
+      </w:r>
+    </w:p>
+    <w:p>
+      <w:pPr>
+        <w:pStyle w:val="Heading1"/>
+      </w:pPr>
+      <w:r>
+        <w:t>T9/T12 Addendum - 2026-05-13</w:t>
+      </w:r>
+    </w:p>
+    <w:p>
+      <w:r>
+        <w:t>A follow-up QA pass was performed before PR handoff because T9 and T12 were reported as broken on main. The first QA run had covered patient question creation and doctor-summary print triggering, but it had not fully clicked the clinician structured-response template path or verified the clinician-visible doctor summary after sharing.</w:t>
+      </w:r>
+    </w:p>
+    <w:p>
+      <w:pPr>
+        <w:pStyle w:val="Heading2"/>
+      </w:pPr>
+      <w:r>
+        <w:t>Findings Fixed</w:t>
+      </w:r>
+    </w:p>
+    <w:tbl>
+      <w:tblPr>
+        <w:tblStyle w:val="TableGrid"/>
+        <w:tblW w:type="auto" w:w="0"/>
+        <w:tblLook w:firstColumn="1" w:firstRow="1" w:lastColumn="0" w:lastRow="0" w:noHBand="0" w:noVBand="1" w:val="04A0"/>
+      </w:tblPr>
+      <w:tblGrid>
+        <w:gridCol w:w="3564"/>
+        <w:gridCol w:w="3564"/>
+        <w:gridCol w:w="3564"/>
+        <w:gridCol w:w="3564"/>
+      </w:tblGrid>
+      <w:tr>
+        <w:tc>
+          <w:tcPr>
+            <w:tcW w:type="dxa" w:w="3564"/>
+          </w:tcPr>
+          <w:p>
+            <w:r>
+              <w:t>ID</w:t>
+            </w:r>
+          </w:p>
+        </w:tc>
+        <w:tc>
+          <w:tcPr>
+            <w:tcW w:type="dxa" w:w="3564"/>
+          </w:tcPr>
+          <w:p>
+            <w:r>
+              <w:t>Feature</w:t>
+            </w:r>
+          </w:p>
+        </w:tc>
+        <w:tc>
+          <w:tcPr>
+            <w:tcW w:type="dxa" w:w="3564"/>
+          </w:tcPr>
+          <w:p>
+            <w:r>
+              <w:t>Fix</w:t>
+            </w:r>
+          </w:p>
+        </w:tc>
+        <w:tc>
+          <w:tcPr>
+            <w:tcW w:type="dxa" w:w="3564"/>
+          </w:tcPr>
+          <w:p>
+            <w:r>
+              <w:t>Status</w:t>
+            </w:r>
+          </w:p>
+        </w:tc>
+      </w:tr>
+      <w:tr>
+        <w:tc>
+          <w:tcPr>
+            <w:tcW w:type="dxa" w:w="3564"/>
+          </w:tcPr>
+          <w:p>
+            <w:r>
+              <w:t>QA-010</w:t>
+            </w:r>
+          </w:p>
+        </w:tc>
+        <w:tc>
+          <w:tcPr>
+            <w:tcW w:type="dxa" w:w="3564"/>
+          </w:tcPr>
+          <w:p>
+            <w:r>
+              <w:t>Clinician structured response template</w:t>
+            </w:r>
+          </w:p>
+        </w:tc>
+        <w:tc>
+          <w:tcPr>
+            <w:tcW w:type="dxa" w:w="3564"/>
+          </w:tcPr>
+          <w:p>
+            <w:r>
+              <w:t>The template was hidden behind a patient-visible Simulate Clinician Access toggle. It is now role-gated to clinicians and was submitted successfully in the browser click-through.</w:t>
+            </w:r>
+          </w:p>
+        </w:tc>
+        <w:tc>
+          <w:tcPr>
+            <w:tcW w:type="dxa" w:w="3564"/>
+          </w:tcPr>
+          <w:p>
+            <w:r>
+              <w:t>Retest passed</w:t>
+            </w:r>
+          </w:p>
+        </w:tc>
+      </w:tr>
+      <w:tr>
+        <w:tc>
+          <w:tcPr>
+            <w:tcW w:type="dxa" w:w="3564"/>
+          </w:tcPr>
+          <w:p>
+            <w:r>
+              <w:t>QA-011</w:t>
+            </w:r>
+          </w:p>
+        </w:tc>
+        <w:tc>
+          <w:tcPr>
+            <w:tcW w:type="dxa" w:w="3564"/>
+          </w:tcPr>
+          <w:p>
+            <w:r>
+              <w:t>Full-report share scope</w:t>
+            </w:r>
+          </w:p>
+        </w:tc>
+        <w:tc>
+          <w:tcPr>
+            <w:tcW w:type="dxa" w:w="3564"/>
+          </w:tcPr>
+          <w:p>
+            <w:r>
+              <w:t>The Full report UI was sending patient-wide scope, so a clinician could open a different patient report before the report with the thread. Full report now shares the exact report with comment/thread access.</w:t>
+            </w:r>
+          </w:p>
+        </w:tc>
+        <w:tc>
+          <w:tcPr>
+            <w:tcW w:type="dxa" w:w="3564"/>
+          </w:tcPr>
+          <w:p>
+            <w:r>
+              <w:t>Retest passed</w:t>
+            </w:r>
+          </w:p>
+        </w:tc>
+      </w:tr>
+      <w:tr>
+        <w:tc>
+          <w:tcPr>
+            <w:tcW w:type="dxa" w:w="3564"/>
+          </w:tcPr>
+          <w:p>
+            <w:r>
+              <w:t>QA-012</w:t>
+            </w:r>
+          </w:p>
+        </w:tc>
+        <w:tc>
+          <w:tcPr>
+            <w:tcW w:type="dxa" w:w="3564"/>
+          </w:tcPr>
+          <w:p>
+            <w:r>
+              <w:t>Doctor-summary include flag</w:t>
+            </w:r>
+          </w:p>
+        </w:tc>
+        <w:tc>
+          <w:tcPr>
+            <w:tcW w:type="dxa" w:w="3564"/>
+          </w:tcPr>
+          <w:p>
+            <w:r>
+              <w:t>The Include Doctor-Ready Summary PDF flag was not persisted through the share API. It is now stored on consent shares, returned by shared-report detail, and shown to the clinician.</w:t>
+            </w:r>
+          </w:p>
+        </w:tc>
+        <w:tc>
+          <w:tcPr>
+            <w:tcW w:type="dxa" w:w="3564"/>
+          </w:tcPr>
+          <w:p>
+            <w:r>
+              <w:t>Retest passed</w:t>
+            </w:r>
+          </w:p>
+        </w:tc>
+      </w:tr>
+      <w:tr>
+        <w:tc>
+          <w:tcPr>
+            <w:tcW w:type="dxa" w:w="3564"/>
+          </w:tcPr>
+          <w:p>
+            <w:r>
+              <w:t>QA-013</w:t>
+            </w:r>
+          </w:p>
+        </w:tc>
+        <w:tc>
+          <w:tcPr>
+            <w:tcW w:type="dxa" w:w="3564"/>
+          </w:tcPr>
+          <w:p>
+            <w:r>
+              <w:t>Doctor-ready print CSS</w:t>
+            </w:r>
+          </w:p>
+        </w:tc>
+        <w:tc>
+          <w:tcPr>
+            <w:tcW w:type="dxa" w:w="3564"/>
+          </w:tcPr>
+          <w:p>
+            <w:r>
+              <w:t>The real browser PDF was initially blank/dark, then produced extra blank pages. Print CSS now isolates the hidden doctor-summary target and removes the screen report layout footprint.</w:t>
+            </w:r>
+          </w:p>
+        </w:tc>
+        <w:tc>
+          <w:tcPr>
+            <w:tcW w:type="dxa" w:w="3564"/>
+          </w:tcPr>
+          <w:p>
+            <w:r>
+              <w:t>Retest passed</w:t>
+            </w:r>
+          </w:p>
+        </w:tc>
+      </w:tr>
+    </w:tbl>
+    <w:p>
+      <w:pPr>
+        <w:pStyle w:val="Heading2"/>
+      </w:pPr>
+      <w:r>
+        <w:t>Retest Evidence</w:t>
+      </w:r>
+    </w:p>
+    <w:p>
+      <w:pPr>
+        <w:pStyle w:val="ListBullet"/>
+      </w:pPr>
+      <w:r>
+        <w:t>Backend targeted test passed: tests/test_clinician_endpoints.py::test_shared_report_detail_preserves_doctor_summary_flag.</w:t>
+      </w:r>
+    </w:p>
+    <w:p>
+      <w:pPr>
+        <w:pStyle w:val="ListBullet"/>
+      </w:pPr>
+      <w:r>
+        <w:t>Frontend targeted tests passed: ThreadsFlow.test.tsx, T15ClinicianReportView.test.tsx, and ReportsFlow.test.tsx, 21 tests total.</w:t>
+      </w:r>
+    </w:p>
+    <w:p>
+      <w:pPr>
+        <w:pStyle w:val="ListBullet"/>
+      </w:pPr>
+      <w:r>
+        <w:t>Enhanced browser click-through passed 13/13 workflow groups and now includes clinician structured template submission plus clinician-visible Doctor Summary.</w:t>
+      </w:r>
+    </w:p>
+    <w:p>
+      <w:pPr>
+        <w:pStyle w:val="ListBullet"/>
+      </w:pPr>
+      <w:r>
+        <w:t>Live OpenAI generation quality remains blocked until a real OPENAI_API_KEY is provided; fallback behavior is still verified.</w:t>
+      </w:r>
+    </w:p>
+    <w:p>
+      <w:pPr>
+        <w:pStyle w:val="ListBullet"/>
+      </w:pPr>
+      <w:r>
+        <w:t>Doctor-ready PDF verification: browser-generated PDF is one A4 page, readable when rendered, and contains extracted ReportX/Flagged Values text.</w:t>
+      </w:r>
+    </w:p>
     <w:sectPr>
       <w:footerReference w:type="default" r:id="rId15"/>
       <w:pgSz w:w="15840" w:h="12240" w:orient="landscape"/>

</xml_diff>

<commit_message>
Fix live OpenAI parse QA smoke
</commit_message>
<xml_diff>
--- a/output/doc/ReportX-Full-Main-QA-Report-2026-05-13.docx
+++ b/output/doc/ReportX-Full-Main-QA-Report-2026-05-13.docx
@@ -400,6 +400,14 @@
       <w:pPr>
         <w:pStyle w:val="ListBullet"/>
       </w:pPr>
+      <w:r>
+        <w:t>Live OpenAI Retest Addendum - 2026-05-13</w:t>
+      </w:r>
+    </w:p>
+    <w:p>
+      <w:pPr>
+        <w:pStyle w:val="ListBullet"/>
+      </w:pPr>
       <w:hyperlink w:anchor="Conclusion">
         <w:r>
           <w:rPr>
@@ -422,12 +430,12 @@
     </w:p>
     <w:p>
       <w:r>
-        <w:t>This QA pass verified latest `origin/main` from a clean worktree, launched the full Docker stack, tested backend and frontend automation, and then completed a real browser click-through of the main user workflows. Nine defects were found and fixed during the pass. The final state is strong: backend tests pass, frontend lint/typecheck/Vitest/build pass, production dependency audit is clean, Docker health checks pass, and the browser-driven click-through completed 13 workflow groups with zero failed steps.</w:t>
+        <w:t>This QA pass verified latest `origin/main` from a clean worktree, launched the full Docker stack, tested backend and frontend automation, and then completed a real browser click-through of the main user workflows. Fourteen defects were found and fixed during the pass, including a live OpenAI parse integration issue found after a real key was supplied locally. The final state is strong: backend tests pass, frontend lint/typecheck/Vitest/build pass, production dependency audit is clean, Docker health checks pass, and the browser-driven click-through completed 13 workflow groups with zero failed steps.</w:t>
       </w:r>
     </w:p>
     <w:p>
       <w:r>
-        <w:t>The only material limitation is environment-related: no real `OPENAI_API_KEY` was available in this worktree, so live OpenAI interpretation/translation quality was not verified. The UI and API fallback behavior for missing-key conditions was verified instead.</w:t>
+        <w:t>The original missing-key limitation has been cleared for the core AI paths. A local, git-ignored `.env` was updated with a real OpenAI key after the first pass, and the live smoke verified OpenAI auth, parse extraction, interpretation, Spanish translation, and AI-generated patient questions without committing any secret.</w:t>
       </w:r>
     </w:p>
     <w:p>
@@ -478,7 +486,7 @@
         <w:pStyle w:val="ListBullet"/>
       </w:pPr>
       <w:r>
-        <w:t>`OPENAI_API_KEY` was not available in the process environment at QA setup time. Live AI checks require a real key to be added locally before Batch 2 and Batch 3 can be fully completed.</w:t>
+        <w:t>`OPENAI_API_KEY` was not available in the process environment at initial QA setup time, so missing-key fallback behavior was tested first. A real OpenAI key was later added only to local `.env`, which remains git-ignored and was not committed. Live OpenAI smoke after the key was added: parse returned 3 rows, interpretation returned a 1416-character summary, Spanish translation returned 1615 characters and changed the source text, and AI question generation returned 3 non-generic patient questions.</w:t>
       </w:r>
     </w:p>
     <w:p>
@@ -2589,7 +2597,7 @@
         <w:pStyle w:val="ListBullet"/>
       </w:pPr>
       <w:r>
-        <w:t>Final `npm test`: passed, 36 files / 175 tests.</w:t>
+        <w:t>Final `npm test`: passed, 36 files / 177 tests.</w:t>
       </w:r>
     </w:p>
     <w:p>
@@ -2705,7 +2713,7 @@
         <w:pStyle w:val="ListBullet"/>
       </w:pPr>
       <w:r>
-        <w:t>Interpretation endpoint returned a safe fallback summary because no live OpenAI key is configured in this QA worktree.</w:t>
+        <w:t>Initial no-key run verified safe interpretation fallback behavior. After a real key was added locally, live interpretation returned a 1416-character OpenAI-generated summary.</w:t>
       </w:r>
     </w:p>
     <w:p>
@@ -2771,7 +2779,7 @@
         <w:pStyle w:val="ListBullet"/>
       </w:pPr>
       <w:r>
-        <w:t>Live English-to-Spanish/Arabic/Chinese/Hindi/French quality checks remain blocked until a real `OPENAI_API_KEY` is placed in the local `.env`.</w:t>
+        <w:t>Live English-to-Spanish translation with the supplied local key returned 1615 characters and preserved the medical context while changing the language. Full live Spanish, Arabic, Chinese, Hindi, and French browser quality comparison remains a manual language-review task; the backend live OpenAI path itself is no longer blocked by missing credentials.</w:t>
       </w:r>
     </w:p>
     <w:p>
@@ -2947,7 +2955,7 @@
         <w:pStyle w:val="ListBullet"/>
       </w:pPr>
       <w:r>
-        <w:t>Patient question generation returned 3 prompts.</w:t>
+        <w:t>Patient question generation returned 3 prompts. Live OpenAI question generation with flagged hemoglobin/glucose findings returned 3 non-generic patient questions and did not use the generic fallback.</w:t>
       </w:r>
     </w:p>
     <w:p>
@@ -3129,7 +3137,7 @@
         <w:pStyle w:val="ListBullet"/>
       </w:pPr>
       <w:r>
-        <w:t>Frontend `npm test`: passed, 36 files / 175 tests. Existing React `act(...)` warnings remain in test output.</w:t>
+        <w:t>Frontend `npm test`: passed, 36 files / 177 tests. Existing React `act(...)` warnings remain in test output.</w:t>
       </w:r>
     </w:p>
     <w:p>
@@ -3161,7 +3169,7 @@
         <w:pStyle w:val="ListBullet"/>
       </w:pPr>
       <w:r>
-        <w:t>Final live smoke passed: frontend home, frontend health, backend health with request ID, parse, interpret fallback, register, login, refresh, reports create/list/detail, trends, share, clinician access, revoke, question prompts fallback, thread messages, notifications unread/read-all.</w:t>
+        <w:t>Final live smoke passed: frontend home, frontend health, backend health with request ID, parse, live OpenAI interpret, live Spanish translation, register, login, refresh, reports create/list/detail, trends, share, clinician access, revoke, live question prompts, thread messages, notifications unread/read-all.</w:t>
       </w:r>
     </w:p>
     <w:p>
@@ -3177,7 +3185,7 @@
         <w:pStyle w:val="ListBullet"/>
       </w:pPr>
       <w:r>
-        <w:t>Post-browser-fix regression passed again: backend pytest, frontend lint, typecheck, Vitest 36 files / 175 tests, production audit, production build, Docker frontend health, and Docker backend health.</w:t>
+        <w:t>Post-browser-fix regression passed again: backend pytest, frontend lint, typecheck, Vitest 36 files / 177 tests, production audit, production build, Docker frontend health, and Docker backend health.</w:t>
       </w:r>
     </w:p>
     <w:p>
@@ -3185,7 +3193,7 @@
         <w:pStyle w:val="ListBullet"/>
       </w:pPr>
       <w:r>
-        <w:t>Backend logs after smoke contain expected `missing_api_key` fallback traces during question generation because this QA worktree still does not have a real `OPENAI_API_KEY`. Live OpenAI interpretation and translation quality checks are still blocked until that local secret is supplied.</w:t>
+        <w:t>After the key was supplied, OpenAI auth was confirmed with a direct LIVE_CHECK_OK response and the app-level live smoke passed for parse, interpretation, translation, and patient question generation.</w:t>
       </w:r>
     </w:p>
     <w:p>
@@ -3200,12 +3208,12 @@
     </w:p>
     <w:p>
       <w:r>
-        <w:t>The full-main QA pass is complete for the environment available here. The application now launches cleanly in Docker, passes the backend and frontend regression suites, and has been exercised through the core product flows in a real browser. The browser run did not only confirm behavior; it found additional frontend/backend integration defects that were fixed and retested.</w:t>
+        <w:t>The full-main QA pass is complete for the environment available here. The application now launches cleanly in Docker, passes the backend and frontend regression suites, has been exercised through the core product flows in a real browser, and has now also passed core live OpenAI smoke testing with a local key. The browser and live-key runs did not only confirm behavior; they found additional frontend/backend/AI integration defects that were fixed and retested.</w:t>
       </w:r>
     </w:p>
     <w:p>
       <w:r>
-        <w:t>Final signoff status: conditionally passed. The condition is that live OpenAI quality checks still require adding a real `OPENAI_API_KEY` to the local `.env` and rerunning the AI-specific parse/explain/translation cases. Everything else covered by this pass is green.</w:t>
+        <w:t>Final signoff status: passed for the tested scope. Remaining manual QA beyond this pass is language-quality review across Spanish, Arabic, Chinese, Hindi, and French by fluent reviewers, plus any product-owner review of clinical wording.</w:t>
       </w:r>
     </w:p>
     <w:p>
@@ -3456,6 +3464,48 @@
           </w:p>
         </w:tc>
       </w:tr>
+      <w:tr>
+        <w:tc>
+          <w:tcPr>
+            <w:tcW w:type="dxa" w:w="3564"/>
+          </w:tcPr>
+          <w:p>
+            <w:r>
+              <w:t>QA-014</w:t>
+            </w:r>
+          </w:p>
+        </w:tc>
+        <w:tc>
+          <w:tcPr>
+            <w:tcW w:type="dxa" w:w="3564"/>
+          </w:tcPr>
+          <w:p>
+            <w:r>
+              <w:t>Live OpenAI parse extraction with gpt-5</w:t>
+            </w:r>
+          </w:p>
+        </w:tc>
+        <w:tc>
+          <w:tcPr>
+            <w:tcW w:type="dxa" w:w="3564"/>
+          </w:tcPr>
+          <w:p>
+            <w:r>
+              <w:t>Responses API rejected the temperature parameter for gpt-5 during live parse. The parse LLM client now omits temperature for gpt-5, o*, omni, and gpt-4.1 models, with a regression test.</w:t>
+            </w:r>
+          </w:p>
+        </w:tc>
+        <w:tc>
+          <w:tcPr>
+            <w:tcW w:type="dxa" w:w="3564"/>
+          </w:tcPr>
+          <w:p>
+            <w:r>
+              <w:t>Retest passed</w:t>
+            </w:r>
+          </w:p>
+        </w:tc>
+      </w:tr>
     </w:tbl>
     <w:p>
       <w:pPr>
@@ -3494,7 +3544,7 @@
         <w:pStyle w:val="ListBullet"/>
       </w:pPr>
       <w:r>
-        <w:t>Live OpenAI generation quality remains blocked until a real OPENAI_API_KEY is provided; fallback behavior is still verified.</w:t>
+        <w:t>Live OpenAI generation quality is no longer blocked for the core smoke path. A local key was supplied and retested for parse, interpretation, Spanish translation, and patient question generation.</w:t>
       </w:r>
     </w:p>
     <w:p>
@@ -3503,6 +3553,76 @@
       </w:pPr>
       <w:r>
         <w:t>Doctor-ready PDF verification: browser-generated PDF is one A4 page, readable when rendered, and contains extracted ReportX/Flagged Values text.</w:t>
+      </w:r>
+    </w:p>
+    <w:p/>
+    <w:p>
+      <w:pPr>
+        <w:pStyle w:val="Heading1"/>
+      </w:pPr>
+      <w:r>
+        <w:t>Live OpenAI Retest Addendum - 2026-05-13</w:t>
+      </w:r>
+    </w:p>
+    <w:p>
+      <w:r>
+        <w:t>A real OpenAI key was supplied after the first QA pass and placed only in local `.env`. The key was not committed. The backend container was recreated with the updated environment and the live AI paths were retested.</w:t>
+      </w:r>
+    </w:p>
+    <w:p>
+      <w:pPr>
+        <w:pStyle w:val="ListBullet"/>
+      </w:pPr>
+      <w:r>
+        <w:t>Direct OpenAI auth check returned LIVE_CHECK_OK.</w:t>
+      </w:r>
+    </w:p>
+    <w:p>
+      <w:pPr>
+        <w:pStyle w:val="ListBullet"/>
+      </w:pPr>
+      <w:r>
+        <w:t>Live parse smoke returned 3 rows; first row was Hemoglobin.</w:t>
+      </w:r>
+    </w:p>
+    <w:p>
+      <w:pPr>
+        <w:pStyle w:val="ListBullet"/>
+      </w:pPr>
+      <w:r>
+        <w:t>Live interpretation returned a 1416-character summary without missing-key fallback.</w:t>
+      </w:r>
+    </w:p>
+    <w:p>
+      <w:pPr>
+        <w:pStyle w:val="ListBullet"/>
+      </w:pPr>
+      <w:r>
+        <w:t>Live Spanish translation returned 1615 characters and changed the source text.</w:t>
+      </w:r>
+    </w:p>
+    <w:p>
+      <w:pPr>
+        <w:pStyle w:val="ListBullet"/>
+      </w:pPr>
+      <w:r>
+        <w:t>Live AI patient question generation returned 3 non-generic questions; generic_fallback was false.</w:t>
+      </w:r>
+    </w:p>
+    <w:p>
+      <w:pPr>
+        <w:pStyle w:val="ListBullet"/>
+      </w:pPr>
+      <w:r>
+        <w:t>Post-QA-014 verification passed: backend `python -m pytest -q`, Docker backend health 200, live parse 3 rows, live interpretation 1416 summary characters, live Spanish translation 1615 characters, and live AI question generation 3 non-generic prompts.</w:t>
+      </w:r>
+    </w:p>
+    <w:p>
+      <w:pPr>
+        <w:pStyle w:val="ListBullet"/>
+      </w:pPr>
+      <w:r>
+        <w:t>The live key uncovered QA-014, a gpt-5 temperature-parameter incompatibility in parse extraction; the fix was tested and the smoke was rerun successfully.</w:t>
       </w:r>
     </w:p>
     <w:sectPr>

</xml_diff>